<commit_message>
Update resume and Amazon CV experience
</commit_message>
<xml_diff>
--- a/files/Resume.docx
+++ b/files/Resume.docx
@@ -1,6 +1,6 @@
 
 <file path=word/document.xml><?xml version="1.0" encoding="utf-8"?>
-<w:document xmlns:wpc="http://schemas.microsoft.com/office/word/2010/wordprocessingCanvas" xmlns:cx="http://schemas.microsoft.com/office/drawing/2014/chartex" xmlns:cx1="http://schemas.microsoft.com/office/drawing/2015/9/8/chartex" xmlns:cx2="http://schemas.microsoft.com/office/drawing/2015/10/21/chartex" xmlns:cx3="http://schemas.microsoft.com/office/drawing/2016/5/9/chartex" xmlns:cx4="http://schemas.microsoft.com/office/drawing/2016/5/10/chartex" xmlns:cx5="http://schemas.microsoft.com/office/drawing/2016/5/11/chartex" xmlns:cx6="http://schemas.microsoft.com/office/drawing/2016/5/12/chartex" xmlns:cx7="http://schemas.microsoft.com/office/drawing/2016/5/13/chartex" xmlns:cx8="http://schemas.microsoft.com/office/drawing/2016/5/14/chartex" xmlns:mc="http://schemas.openxmlformats.org/markup-compatibility/2006" xmlns:aink="http://schemas.microsoft.com/office/drawing/2016/ink" xmlns:am3d="http://schemas.microsoft.com/office/drawing/2017/model3d" xmlns:o="urn:schemas-microsoft-com:office:office" xmlns:oel="http://schemas.microsoft.com/office/2019/extlst" xmlns:r="http://schemas.openxmlformats.org/officeDocument/2006/relationships" xmlns:m="http://schemas.openxmlformats.org/officeDocument/2006/math" xmlns:v="urn:schemas-microsoft-com:vml" xmlns:wp14="http://schemas.microsoft.com/office/word/2010/wordprocessingDrawing" xmlns:wp="http://schemas.openxmlformats.org/drawingml/2006/wordprocessingDrawing" xmlns:w10="urn:schemas-microsoft-com:office:word" xmlns:w="http://schemas.openxmlformats.org/wordprocessingml/2006/main" xmlns:w14="http://schemas.microsoft.com/office/word/2010/wordml" xmlns:w15="http://schemas.microsoft.com/office/word/2012/wordml" xmlns:w16cei="http://schemas.microsoft.com/office/word/2026/wordml/cei" xmlns:w16cex="http://schemas.microsoft.com/office/word/2018/wordml/cex" xmlns:w16cid="http://schemas.microsoft.com/office/word/2016/wordml/cid" xmlns:w16="http://schemas.microsoft.com/office/word/2018/wordml" xmlns:w16du="http://schemas.microsoft.com/office/word/2023/wordml/word16du" xmlns:w16sdtdh="http://schemas.microsoft.com/office/word/2020/wordml/sdtdatahash" xmlns:w16sdtfl="http://schemas.microsoft.com/office/word/2024/wordml/sdtformatlock" xmlns:w16se="http://schemas.microsoft.com/office/word/2015/wordml/symex" xmlns:wpg="http://schemas.microsoft.com/office/word/2010/wordprocessingGroup" xmlns:wpi="http://schemas.microsoft.com/office/word/2010/wordprocessingInk" xmlns:wne="http://schemas.microsoft.com/office/word/2006/wordml" xmlns:wps="http://schemas.microsoft.com/office/word/2010/wordprocessingShape" mc:Ignorable="w14 w15 w16se w16cid w16 w16cex w16sdtdh w16sdtfl w16du wp14">
+<w:document xmlns:wpc="http://schemas.microsoft.com/office/word/2010/wordprocessingCanvas" xmlns:cx="http://schemas.microsoft.com/office/drawing/2014/chartex" xmlns:cx1="http://schemas.microsoft.com/office/drawing/2015/9/8/chartex" xmlns:cx2="http://schemas.microsoft.com/office/drawing/2015/10/21/chartex" xmlns:cx3="http://schemas.microsoft.com/office/drawing/2016/5/9/chartex" xmlns:cx4="http://schemas.microsoft.com/office/drawing/2016/5/10/chartex" xmlns:cx5="http://schemas.microsoft.com/office/drawing/2016/5/11/chartex" xmlns:cx6="http://schemas.microsoft.com/office/drawing/2016/5/12/chartex" xmlns:cx7="http://schemas.microsoft.com/office/drawing/2016/5/13/chartex" xmlns:cx8="http://schemas.microsoft.com/office/drawing/2016/5/14/chartex" xmlns:mc="http://schemas.openxmlformats.org/markup-compatibility/2006" xmlns:aink="http://schemas.microsoft.com/office/drawing/2016/ink" xmlns:am3d="http://schemas.microsoft.com/office/drawing/2017/model3d" xmlns:o="urn:schemas-microsoft-com:office:office" xmlns:oel="http://schemas.microsoft.com/office/2019/extlst" xmlns:r="http://schemas.openxmlformats.org/officeDocument/2006/relationships" xmlns:m="http://schemas.openxmlformats.org/officeDocument/2006/math" xmlns:v="urn:schemas-microsoft-com:vml" xmlns:wp14="http://schemas.microsoft.com/office/word/2010/wordprocessingDrawing" xmlns:wp="http://schemas.openxmlformats.org/drawingml/2006/wordprocessingDrawing" xmlns:w10="urn:schemas-microsoft-com:office:word" xmlns:w="http://schemas.openxmlformats.org/wordprocessingml/2006/main" xmlns:w14="http://schemas.microsoft.com/office/word/2010/wordml" xmlns:w15="http://schemas.microsoft.com/office/word/2012/wordml" xmlns:w16cex="http://schemas.microsoft.com/office/word/2018/wordml/cex" xmlns:w16cid="http://schemas.microsoft.com/office/word/2016/wordml/cid" xmlns:w16="http://schemas.microsoft.com/office/word/2018/wordml" xmlns:w16du="http://schemas.microsoft.com/office/word/2023/wordml/word16du" xmlns:w16sdtdh="http://schemas.microsoft.com/office/word/2020/wordml/sdtdatahash" xmlns:w16sdtfl="http://schemas.microsoft.com/office/word/2024/wordml/sdtformatlock" xmlns:w16se="http://schemas.microsoft.com/office/word/2015/wordml/symex" xmlns:wpg="http://schemas.microsoft.com/office/word/2010/wordprocessingGroup" xmlns:wpi="http://schemas.microsoft.com/office/word/2010/wordprocessingInk" xmlns:wne="http://schemas.microsoft.com/office/word/2006/wordml" xmlns:wps="http://schemas.microsoft.com/office/word/2010/wordprocessingShape" mc:Ignorable="w14 w15 w16se w16cid w16 w16cex w16sdtdh w16sdtfl w16du wp14">
   <w:background w:color="FFFFFF"/>
   <w:body>
     <w:p>
@@ -1257,7 +1257,7 @@
           <w:sz w:val="21"/>
           <w:szCs w:val="21"/>
         </w:rPr>
-        <w:t>Designed and implemented a production risk labeling system spanning Aurora PostgreSQL, Java services on AWS Lambda, REST APIs, and a React and TypeScript UI, replacing schema migrations and code deployments for each new risk category with a self-service workflow that reduced recurring report preparation time by about 50%</w:t>
+        <w:t>Designed and launched an end-to-end production risk-labeling system spanning Aurora PostgreSQL, Java services on AWS Lambda, 18 REST API operations, and a React/TypeScript UI, replacing recurring schema migrations and deployments with self-service classification management</w:t>
       </w:r>
     </w:p>
     <w:p>
@@ -1283,43 +1283,7 @@
           <w:sz w:val="21"/>
           <w:szCs w:val="21"/>
         </w:rPr>
-        <w:t xml:space="preserve">Identified and fixed a </w:t>
-      </w:r>
-      <w:r>
-        <w:rPr>
-          <w:rFonts w:ascii="Calibri" w:eastAsia="Times New Roman" w:hAnsi="Calibri" w:cs="Calibri"/>
-          <w:color w:val="000000"/>
-          <w:sz w:val="21"/>
-          <w:szCs w:val="21"/>
-        </w:rPr>
-        <w:t>cross-scope</w:t>
-      </w:r>
-      <w:r>
-        <w:rPr>
-          <w:rFonts w:ascii="Calibri" w:eastAsia="Times New Roman" w:hAnsi="Calibri" w:cs="Calibri"/>
-          <w:color w:val="000000"/>
-          <w:sz w:val="21"/>
-          <w:szCs w:val="21"/>
-        </w:rPr>
-        <w:t xml:space="preserve"> confidentiality leak and a concurrent write race in the Java backend, deriving authorization from persisted records and making label writes idempotent under UNIQUE and primary key contention through explicit transaction handling, constraint translation, and post</w:t>
-      </w:r>
-      <w:r>
-        <w:rPr>
-          <w:rFonts w:ascii="Calibri" w:hAnsi="Calibri" w:cs="Calibri" w:hint="eastAsia"/>
-          <w:color w:val="000000"/>
-          <w:sz w:val="21"/>
-          <w:szCs w:val="21"/>
-        </w:rPr>
-        <w:t>-</w:t>
-      </w:r>
-      <w:r>
-        <w:rPr>
-          <w:rFonts w:ascii="Calibri" w:eastAsia="Times New Roman" w:hAnsi="Calibri" w:cs="Calibri"/>
-          <w:color w:val="000000"/>
-          <w:sz w:val="21"/>
-          <w:szCs w:val="21"/>
-        </w:rPr>
-        <w:t>transaction reads</w:t>
+        <w:t>Strengthened record-scoped authorization and concurrent-write reliability by deriving access decisions from persisted records and implementing idempotent label writes with explicit transaction handling, constraint translation, and post-transaction reads</w:t>
       </w:r>
     </w:p>
     <w:p>
@@ -1345,43 +1309,7 @@
           <w:sz w:val="21"/>
           <w:szCs w:val="21"/>
         </w:rPr>
-        <w:t>Built keyset</w:t>
-      </w:r>
-      <w:r>
-        <w:rPr>
-          <w:rFonts w:ascii="Calibri" w:hAnsi="Calibri" w:cs="Calibri" w:hint="eastAsia"/>
-          <w:color w:val="000000"/>
-          <w:sz w:val="21"/>
-          <w:szCs w:val="21"/>
-        </w:rPr>
-        <w:t>-</w:t>
-      </w:r>
-      <w:r>
-        <w:rPr>
-          <w:rFonts w:ascii="Calibri" w:eastAsia="Times New Roman" w:hAnsi="Calibri" w:cs="Calibri"/>
-          <w:color w:val="000000"/>
-          <w:sz w:val="21"/>
-          <w:szCs w:val="21"/>
-        </w:rPr>
-        <w:t>batched bulk labeling for up to 500 risks per request with partial result handling, and developed the AWS Cloudscape governance UI with filtering, grouping, usage drill downs, chang</w:t>
-      </w:r>
-      <w:r>
-        <w:rPr>
-          <w:rFonts w:ascii="Calibri" w:hAnsi="Calibri" w:cs="Calibri" w:hint="eastAsia"/>
-          <w:color w:val="000000"/>
-          <w:sz w:val="21"/>
-          <w:szCs w:val="21"/>
-        </w:rPr>
-        <w:t>e</w:t>
-      </w:r>
-      <w:r>
-        <w:rPr>
-          <w:rFonts w:ascii="Calibri" w:eastAsia="Times New Roman" w:hAnsi="Calibri" w:cs="Calibri"/>
-          <w:color w:val="000000"/>
-          <w:sz w:val="21"/>
-          <w:szCs w:val="21"/>
-        </w:rPr>
-        <w:t xml:space="preserve"> history, and CSV and Excel export hardened against spreadsheet formula injection</w:t>
+        <w:t>Built keyset-batched bulk labeling for up to 500 risks per request with item-level outcomes and delivered an AWS Cloudscape governance UI with filtering, grouping, drill-downs, and change history; reduced grouped-report API calls from 10 to 1 and data-fetch latency by approximately 80%; and implemented formula-safe CSV/Excel exports</w:t>
       </w:r>
     </w:p>
     <w:p>
@@ -1709,25 +1637,16 @@
           <w:sz w:val="21"/>
           <w:szCs w:val="21"/>
         </w:rPr>
-        <w:t>101, and YAM robots, with joint position and velocity control and real</w:t>
-      </w:r>
-      <w:r>
-        <w:rPr>
-          <w:rFonts w:ascii="Calibri" w:hAnsi="Calibri" w:cs="Calibri" w:hint="eastAsia"/>
-          <w:color w:val="000000"/>
-          <w:sz w:val="21"/>
-          <w:szCs w:val="21"/>
-        </w:rPr>
-        <w:t>-</w:t>
-      </w:r>
-      <w:r>
-        <w:rPr>
-          <w:rFonts w:ascii="Calibri" w:eastAsia="Times New Roman" w:hAnsi="Calibri" w:cs="Calibri"/>
-          <w:color w:val="000000"/>
-          <w:sz w:val="21"/>
-          <w:szCs w:val="21"/>
-        </w:rPr>
-        <w:t>time FR3 inference</w:t>
+        <w:t xml:space="preserve">101, and YAM robots, with joint position and velocity control and </w:t>
+      </w:r>
+      <w:r>
+        <w:rPr>
+          <w:rFonts w:ascii="Calibri" w:eastAsia="Times New Roman" w:hAnsi="Calibri" w:cs="Calibri"/>
+          <w:color w:val="000000"/>
+          <w:sz w:val="21"/>
+          <w:szCs w:val="21"/>
+        </w:rPr>
+        <w:t>real-time policy inference on the FR3</w:t>
       </w:r>
     </w:p>
     <w:p>
@@ -1753,7 +1672,7 @@
           <w:sz w:val="21"/>
           <w:szCs w:val="21"/>
         </w:rPr>
-        <w:t>Built a multithreaded stack for teleoperation, policy inference, synchronized logging, replay, calibration, validation, and data conversion, reducing 100-episode rollout time from about 4 hours to 100 minutes while supporting GELLO and Meta Quest 2 control</w:t>
+        <w:t>Built a multithreaded stack for teleoperation, policy inference, synchronized logging, replay, calibration, validation, and data conversion, reducing the time to collect 100 rollout episodes from about 4 hours to 100 minutes while supporting GELLO and Meta Quest 2 control</w:t>
       </w:r>
     </w:p>
     <w:p>
@@ -2014,25 +1933,7 @@
           <w:sz w:val="21"/>
           <w:szCs w:val="21"/>
         </w:rPr>
-        <w:t xml:space="preserve">Created an end-to-end imitation-learning training platform for the ALOHA VX300S robotic arm, achieving 100% grasp success in simulation across a </w:t>
-      </w:r>
-      <w:r>
-        <w:rPr>
-          <w:rFonts w:ascii="Calibri" w:eastAsia="Times New Roman" w:hAnsi="Calibri" w:cs="Calibri"/>
-          <w:color w:val="000000"/>
-          <w:sz w:val="21"/>
-          <w:szCs w:val="21"/>
-        </w:rPr>
-        <w:t>35-65 cm</w:t>
-      </w:r>
-      <w:r>
-        <w:rPr>
-          <w:rFonts w:ascii="Calibri" w:eastAsia="Times New Roman" w:hAnsi="Calibri" w:cs="Calibri"/>
-          <w:color w:val="000000"/>
-          <w:sz w:val="21"/>
-          <w:szCs w:val="21"/>
-        </w:rPr>
-        <w:t xml:space="preserve"> workspace using a ROS</w:t>
+        <w:t>Created an end-to-end imitation-learning training platform for the</w:t>
       </w:r>
       <w:r>
         <w:rPr>
@@ -2050,7 +1951,16 @@
           <w:sz w:val="21"/>
           <w:szCs w:val="21"/>
         </w:rPr>
-        <w:t>2 and Isaac Sim digital twin with a Transformer-based ACT++ control pipeline</w:t>
+        <w:t>ALOHA-ViperX 300S</w:t>
+      </w:r>
+      <w:r>
+        <w:rPr>
+          <w:rFonts w:ascii="Calibri" w:eastAsia="Times New Roman" w:hAnsi="Calibri" w:cs="Calibri"/>
+          <w:color w:val="000000"/>
+          <w:sz w:val="21"/>
+          <w:szCs w:val="21"/>
+        </w:rPr>
+        <w:t xml:space="preserve"> robotic arm, achieving 100% grasp success in simulation across a 35–65 cm workspace by integrating a ROS 2/NVIDIA Isaac Sim digital twin with a transformer-based ACT++ control pipeline</w:t>
       </w:r>
     </w:p>
     <w:p>
@@ -2076,7 +1986,7 @@
           <w:sz w:val="21"/>
           <w:szCs w:val="21"/>
         </w:rPr>
-        <w:t>Developed a three-stage trajectory planner with real-time IK constraint validation, workspace-bound checking, and dual-camera perception for robust simulated grasping</w:t>
+        <w:t>Developed a three-stage trajectory planner with real-time IK constraint validation, workspace-boundary checks, and dual-camera perception for robust simulated grasping</w:t>
       </w:r>
     </w:p>
     <w:p>
@@ -2102,7 +2012,7 @@
           <w:sz w:val="21"/>
           <w:szCs w:val="21"/>
         </w:rPr>
-        <w:t>Automated ACT++ HDF5 dataset generation from simulation rollouts and documented a reproducible Isaac Sim workflow covering robot control, perception, trajectory generation, and dataset export</w:t>
+        <w:t>Automated generation of ACT++-compatible HDF5 datasets from simulation rollouts and documented a reproducible Isaac Sim workflow covering robot control, perception, trajectory generation, and dataset export</w:t>
       </w:r>
     </w:p>
     <w:p>
@@ -2384,7 +2294,25 @@
           <w:sz w:val="21"/>
           <w:szCs w:val="21"/>
         </w:rPr>
-        <w:t>), “MolmoB0T: Large-Scale Simulation Enables Zero-Shot Manipulation,” under review at the Conference on Robot Learning (CoRL), 2026. Best Poster Award, IEEE ICRA 2026 Workshop on Synthetic Data for Robot Learning.</w:t>
+        <w:t xml:space="preserve">), “MolmoB0T: Large-Scale Simulation Enables Zero-Shot Manipulation,” under review at the Conference on Robot Learning (CoRL), 2026. Best </w:t>
+      </w:r>
+      <w:r>
+        <w:rPr>
+          <w:rFonts w:ascii="Calibri" w:hAnsi="Calibri" w:cs="Calibri" w:hint="eastAsia"/>
+          <w:color w:val="000000"/>
+          <w:sz w:val="21"/>
+          <w:szCs w:val="21"/>
+        </w:rPr>
+        <w:t>Paper</w:t>
+      </w:r>
+      <w:r>
+        <w:rPr>
+          <w:rFonts w:ascii="Calibri" w:eastAsia="Times New Roman" w:hAnsi="Calibri" w:cs="Calibri"/>
+          <w:color w:val="000000"/>
+          <w:sz w:val="21"/>
+          <w:szCs w:val="21"/>
+        </w:rPr>
+        <w:t xml:space="preserve"> Award, IEEE ICRA 2026 Workshop on Synthetic Data for Robot Learning.</w:t>
       </w:r>
       <w:r>
         <w:rPr>
@@ -2698,7 +2626,7 @@
 </file>
 
 <file path=word/endnotes.xml><?xml version="1.0" encoding="utf-8"?>
-<w:endnotes xmlns:wpc="http://schemas.microsoft.com/office/word/2010/wordprocessingCanvas" xmlns:cx="http://schemas.microsoft.com/office/drawing/2014/chartex" xmlns:cx1="http://schemas.microsoft.com/office/drawing/2015/9/8/chartex" xmlns:cx2="http://schemas.microsoft.com/office/drawing/2015/10/21/chartex" xmlns:cx3="http://schemas.microsoft.com/office/drawing/2016/5/9/chartex" xmlns:cx4="http://schemas.microsoft.com/office/drawing/2016/5/10/chartex" xmlns:cx5="http://schemas.microsoft.com/office/drawing/2016/5/11/chartex" xmlns:cx6="http://schemas.microsoft.com/office/drawing/2016/5/12/chartex" xmlns:cx7="http://schemas.microsoft.com/office/drawing/2016/5/13/chartex" xmlns:cx8="http://schemas.microsoft.com/office/drawing/2016/5/14/chartex" xmlns:mc="http://schemas.openxmlformats.org/markup-compatibility/2006" xmlns:aink="http://schemas.microsoft.com/office/drawing/2016/ink" xmlns:am3d="http://schemas.microsoft.com/office/drawing/2017/model3d" xmlns:o="urn:schemas-microsoft-com:office:office" xmlns:oel="http://schemas.microsoft.com/office/2019/extlst" xmlns:r="http://schemas.openxmlformats.org/officeDocument/2006/relationships" xmlns:m="http://schemas.openxmlformats.org/officeDocument/2006/math" xmlns:v="urn:schemas-microsoft-com:vml" xmlns:wp14="http://schemas.microsoft.com/office/word/2010/wordprocessingDrawing" xmlns:wp="http://schemas.openxmlformats.org/drawingml/2006/wordprocessingDrawing" xmlns:w10="urn:schemas-microsoft-com:office:word" xmlns:w="http://schemas.openxmlformats.org/wordprocessingml/2006/main" xmlns:w14="http://schemas.microsoft.com/office/word/2010/wordml" xmlns:w15="http://schemas.microsoft.com/office/word/2012/wordml" xmlns:w16cei="http://schemas.microsoft.com/office/word/2026/wordml/cei" xmlns:w16cex="http://schemas.microsoft.com/office/word/2018/wordml/cex" xmlns:w16cid="http://schemas.microsoft.com/office/word/2016/wordml/cid" xmlns:w16="http://schemas.microsoft.com/office/word/2018/wordml" xmlns:w16du="http://schemas.microsoft.com/office/word/2023/wordml/word16du" xmlns:w16sdtdh="http://schemas.microsoft.com/office/word/2020/wordml/sdtdatahash" xmlns:w16sdtfl="http://schemas.microsoft.com/office/word/2024/wordml/sdtformatlock" xmlns:w16se="http://schemas.microsoft.com/office/word/2015/wordml/symex" xmlns:wpg="http://schemas.microsoft.com/office/word/2010/wordprocessingGroup" xmlns:wpi="http://schemas.microsoft.com/office/word/2010/wordprocessingInk" xmlns:wne="http://schemas.microsoft.com/office/word/2006/wordml" xmlns:wps="http://schemas.microsoft.com/office/word/2010/wordprocessingShape" mc:Ignorable="w14 w15 w16se w16cid w16 w16cex w16sdtdh w16sdtfl w16du wp14">
+<w:endnotes xmlns:wpc="http://schemas.microsoft.com/office/word/2010/wordprocessingCanvas" xmlns:cx="http://schemas.microsoft.com/office/drawing/2014/chartex" xmlns:cx1="http://schemas.microsoft.com/office/drawing/2015/9/8/chartex" xmlns:cx2="http://schemas.microsoft.com/office/drawing/2015/10/21/chartex" xmlns:cx3="http://schemas.microsoft.com/office/drawing/2016/5/9/chartex" xmlns:cx4="http://schemas.microsoft.com/office/drawing/2016/5/10/chartex" xmlns:cx5="http://schemas.microsoft.com/office/drawing/2016/5/11/chartex" xmlns:cx6="http://schemas.microsoft.com/office/drawing/2016/5/12/chartex" xmlns:cx7="http://schemas.microsoft.com/office/drawing/2016/5/13/chartex" xmlns:cx8="http://schemas.microsoft.com/office/drawing/2016/5/14/chartex" xmlns:mc="http://schemas.openxmlformats.org/markup-compatibility/2006" xmlns:aink="http://schemas.microsoft.com/office/drawing/2016/ink" xmlns:am3d="http://schemas.microsoft.com/office/drawing/2017/model3d" xmlns:o="urn:schemas-microsoft-com:office:office" xmlns:oel="http://schemas.microsoft.com/office/2019/extlst" xmlns:r="http://schemas.openxmlformats.org/officeDocument/2006/relationships" xmlns:m="http://schemas.openxmlformats.org/officeDocument/2006/math" xmlns:v="urn:schemas-microsoft-com:vml" xmlns:wp14="http://schemas.microsoft.com/office/word/2010/wordprocessingDrawing" xmlns:wp="http://schemas.openxmlformats.org/drawingml/2006/wordprocessingDrawing" xmlns:w10="urn:schemas-microsoft-com:office:word" xmlns:w="http://schemas.openxmlformats.org/wordprocessingml/2006/main" xmlns:w14="http://schemas.microsoft.com/office/word/2010/wordml" xmlns:w15="http://schemas.microsoft.com/office/word/2012/wordml" xmlns:w16cex="http://schemas.microsoft.com/office/word/2018/wordml/cex" xmlns:w16cid="http://schemas.microsoft.com/office/word/2016/wordml/cid" xmlns:w16="http://schemas.microsoft.com/office/word/2018/wordml" xmlns:w16du="http://schemas.microsoft.com/office/word/2023/wordml/word16du" xmlns:w16sdtdh="http://schemas.microsoft.com/office/word/2020/wordml/sdtdatahash" xmlns:w16sdtfl="http://schemas.microsoft.com/office/word/2024/wordml/sdtformatlock" xmlns:w16se="http://schemas.microsoft.com/office/word/2015/wordml/symex" xmlns:wpg="http://schemas.microsoft.com/office/word/2010/wordprocessingGroup" xmlns:wpi="http://schemas.microsoft.com/office/word/2010/wordprocessingInk" xmlns:wne="http://schemas.microsoft.com/office/word/2006/wordml" xmlns:wps="http://schemas.microsoft.com/office/word/2010/wordprocessingShape" mc:Ignorable="w14 w15 w16se w16cid w16 w16cex w16sdtdh w16sdtfl w16du wp14">
   <w:endnote w:type="separator" w:id="-1">
     <w:p>
       <w:r>
@@ -2717,7 +2645,7 @@
 </file>
 
 <file path=word/footer1.xml><?xml version="1.0" encoding="utf-8"?>
-<w:ftr xmlns:wpc="http://schemas.microsoft.com/office/word/2010/wordprocessingCanvas" xmlns:cx="http://schemas.microsoft.com/office/drawing/2014/chartex" xmlns:cx1="http://schemas.microsoft.com/office/drawing/2015/9/8/chartex" xmlns:cx2="http://schemas.microsoft.com/office/drawing/2015/10/21/chartex" xmlns:cx3="http://schemas.microsoft.com/office/drawing/2016/5/9/chartex" xmlns:cx4="http://schemas.microsoft.com/office/drawing/2016/5/10/chartex" xmlns:cx5="http://schemas.microsoft.com/office/drawing/2016/5/11/chartex" xmlns:cx6="http://schemas.microsoft.com/office/drawing/2016/5/12/chartex" xmlns:cx7="http://schemas.microsoft.com/office/drawing/2016/5/13/chartex" xmlns:cx8="http://schemas.microsoft.com/office/drawing/2016/5/14/chartex" xmlns:mc="http://schemas.openxmlformats.org/markup-compatibility/2006" xmlns:aink="http://schemas.microsoft.com/office/drawing/2016/ink" xmlns:am3d="http://schemas.microsoft.com/office/drawing/2017/model3d" xmlns:o="urn:schemas-microsoft-com:office:office" xmlns:oel="http://schemas.microsoft.com/office/2019/extlst" xmlns:r="http://schemas.openxmlformats.org/officeDocument/2006/relationships" xmlns:m="http://schemas.openxmlformats.org/officeDocument/2006/math" xmlns:v="urn:schemas-microsoft-com:vml" xmlns:wp14="http://schemas.microsoft.com/office/word/2010/wordprocessingDrawing" xmlns:wp="http://schemas.openxmlformats.org/drawingml/2006/wordprocessingDrawing" xmlns:w10="urn:schemas-microsoft-com:office:word" xmlns:w="http://schemas.openxmlformats.org/wordprocessingml/2006/main" xmlns:w14="http://schemas.microsoft.com/office/word/2010/wordml" xmlns:w15="http://schemas.microsoft.com/office/word/2012/wordml" xmlns:w16cei="http://schemas.microsoft.com/office/word/2026/wordml/cei" xmlns:w16cex="http://schemas.microsoft.com/office/word/2018/wordml/cex" xmlns:w16cid="http://schemas.microsoft.com/office/word/2016/wordml/cid" xmlns:w16="http://schemas.microsoft.com/office/word/2018/wordml" xmlns:w16du="http://schemas.microsoft.com/office/word/2023/wordml/word16du" xmlns:w16sdtdh="http://schemas.microsoft.com/office/word/2020/wordml/sdtdatahash" xmlns:w16sdtfl="http://schemas.microsoft.com/office/word/2024/wordml/sdtformatlock" xmlns:w16se="http://schemas.microsoft.com/office/word/2015/wordml/symex" xmlns:wpg="http://schemas.microsoft.com/office/word/2010/wordprocessingGroup" xmlns:wpi="http://schemas.microsoft.com/office/word/2010/wordprocessingInk" xmlns:wne="http://schemas.microsoft.com/office/word/2006/wordml" xmlns:wps="http://schemas.microsoft.com/office/word/2010/wordprocessingShape" mc:Ignorable="w14 w15 w16se w16cid w16 w16cex w16sdtdh w16sdtfl w16du wp14">
+<w:ftr xmlns:wpc="http://schemas.microsoft.com/office/word/2010/wordprocessingCanvas" xmlns:cx="http://schemas.microsoft.com/office/drawing/2014/chartex" xmlns:cx1="http://schemas.microsoft.com/office/drawing/2015/9/8/chartex" xmlns:cx2="http://schemas.microsoft.com/office/drawing/2015/10/21/chartex" xmlns:cx3="http://schemas.microsoft.com/office/drawing/2016/5/9/chartex" xmlns:cx4="http://schemas.microsoft.com/office/drawing/2016/5/10/chartex" xmlns:cx5="http://schemas.microsoft.com/office/drawing/2016/5/11/chartex" xmlns:cx6="http://schemas.microsoft.com/office/drawing/2016/5/12/chartex" xmlns:cx7="http://schemas.microsoft.com/office/drawing/2016/5/13/chartex" xmlns:cx8="http://schemas.microsoft.com/office/drawing/2016/5/14/chartex" xmlns:mc="http://schemas.openxmlformats.org/markup-compatibility/2006" xmlns:aink="http://schemas.microsoft.com/office/drawing/2016/ink" xmlns:am3d="http://schemas.microsoft.com/office/drawing/2017/model3d" xmlns:o="urn:schemas-microsoft-com:office:office" xmlns:oel="http://schemas.microsoft.com/office/2019/extlst" xmlns:r="http://schemas.openxmlformats.org/officeDocument/2006/relationships" xmlns:m="http://schemas.openxmlformats.org/officeDocument/2006/math" xmlns:v="urn:schemas-microsoft-com:vml" xmlns:wp14="http://schemas.microsoft.com/office/word/2010/wordprocessingDrawing" xmlns:wp="http://schemas.openxmlformats.org/drawingml/2006/wordprocessingDrawing" xmlns:w10="urn:schemas-microsoft-com:office:word" xmlns:w="http://schemas.openxmlformats.org/wordprocessingml/2006/main" xmlns:w14="http://schemas.microsoft.com/office/word/2010/wordml" xmlns:w15="http://schemas.microsoft.com/office/word/2012/wordml" xmlns:w16cex="http://schemas.microsoft.com/office/word/2018/wordml/cex" xmlns:w16cid="http://schemas.microsoft.com/office/word/2016/wordml/cid" xmlns:w16="http://schemas.microsoft.com/office/word/2018/wordml" xmlns:w16du="http://schemas.microsoft.com/office/word/2023/wordml/word16du" xmlns:w16sdtdh="http://schemas.microsoft.com/office/word/2020/wordml/sdtdatahash" xmlns:w16sdtfl="http://schemas.microsoft.com/office/word/2024/wordml/sdtformatlock" xmlns:w16se="http://schemas.microsoft.com/office/word/2015/wordml/symex" xmlns:wpg="http://schemas.microsoft.com/office/word/2010/wordprocessingGroup" xmlns:wpi="http://schemas.microsoft.com/office/word/2010/wordprocessingInk" xmlns:wne="http://schemas.microsoft.com/office/word/2006/wordml" xmlns:wps="http://schemas.microsoft.com/office/word/2010/wordprocessingShape" mc:Ignorable="w14 w15 w16se w16cid w16 w16cex w16sdtdh w16sdtfl w16du wp14">
   <w:p>
     <w:pPr>
       <w:pBdr>
@@ -2742,7 +2670,7 @@
 </file>
 
 <file path=word/footnotes.xml><?xml version="1.0" encoding="utf-8"?>
-<w:footnotes xmlns:wpc="http://schemas.microsoft.com/office/word/2010/wordprocessingCanvas" xmlns:cx="http://schemas.microsoft.com/office/drawing/2014/chartex" xmlns:cx1="http://schemas.microsoft.com/office/drawing/2015/9/8/chartex" xmlns:cx2="http://schemas.microsoft.com/office/drawing/2015/10/21/chartex" xmlns:cx3="http://schemas.microsoft.com/office/drawing/2016/5/9/chartex" xmlns:cx4="http://schemas.microsoft.com/office/drawing/2016/5/10/chartex" xmlns:cx5="http://schemas.microsoft.com/office/drawing/2016/5/11/chartex" xmlns:cx6="http://schemas.microsoft.com/office/drawing/2016/5/12/chartex" xmlns:cx7="http://schemas.microsoft.com/office/drawing/2016/5/13/chartex" xmlns:cx8="http://schemas.microsoft.com/office/drawing/2016/5/14/chartex" xmlns:mc="http://schemas.openxmlformats.org/markup-compatibility/2006" xmlns:aink="http://schemas.microsoft.com/office/drawing/2016/ink" xmlns:am3d="http://schemas.microsoft.com/office/drawing/2017/model3d" xmlns:o="urn:schemas-microsoft-com:office:office" xmlns:oel="http://schemas.microsoft.com/office/2019/extlst" xmlns:r="http://schemas.openxmlformats.org/officeDocument/2006/relationships" xmlns:m="http://schemas.openxmlformats.org/officeDocument/2006/math" xmlns:v="urn:schemas-microsoft-com:vml" xmlns:wp14="http://schemas.microsoft.com/office/word/2010/wordprocessingDrawing" xmlns:wp="http://schemas.openxmlformats.org/drawingml/2006/wordprocessingDrawing" xmlns:w10="urn:schemas-microsoft-com:office:word" xmlns:w="http://schemas.openxmlformats.org/wordprocessingml/2006/main" xmlns:w14="http://schemas.microsoft.com/office/word/2010/wordml" xmlns:w15="http://schemas.microsoft.com/office/word/2012/wordml" xmlns:w16cei="http://schemas.microsoft.com/office/word/2026/wordml/cei" xmlns:w16cex="http://schemas.microsoft.com/office/word/2018/wordml/cex" xmlns:w16cid="http://schemas.microsoft.com/office/word/2016/wordml/cid" xmlns:w16="http://schemas.microsoft.com/office/word/2018/wordml" xmlns:w16du="http://schemas.microsoft.com/office/word/2023/wordml/word16du" xmlns:w16sdtdh="http://schemas.microsoft.com/office/word/2020/wordml/sdtdatahash" xmlns:w16sdtfl="http://schemas.microsoft.com/office/word/2024/wordml/sdtformatlock" xmlns:w16se="http://schemas.microsoft.com/office/word/2015/wordml/symex" xmlns:wpg="http://schemas.microsoft.com/office/word/2010/wordprocessingGroup" xmlns:wpi="http://schemas.microsoft.com/office/word/2010/wordprocessingInk" xmlns:wne="http://schemas.microsoft.com/office/word/2006/wordml" xmlns:wps="http://schemas.microsoft.com/office/word/2010/wordprocessingShape" mc:Ignorable="w14 w15 w16se w16cid w16 w16cex w16sdtdh w16sdtfl w16du wp14">
+<w:footnotes xmlns:wpc="http://schemas.microsoft.com/office/word/2010/wordprocessingCanvas" xmlns:cx="http://schemas.microsoft.com/office/drawing/2014/chartex" xmlns:cx1="http://schemas.microsoft.com/office/drawing/2015/9/8/chartex" xmlns:cx2="http://schemas.microsoft.com/office/drawing/2015/10/21/chartex" xmlns:cx3="http://schemas.microsoft.com/office/drawing/2016/5/9/chartex" xmlns:cx4="http://schemas.microsoft.com/office/drawing/2016/5/10/chartex" xmlns:cx5="http://schemas.microsoft.com/office/drawing/2016/5/11/chartex" xmlns:cx6="http://schemas.microsoft.com/office/drawing/2016/5/12/chartex" xmlns:cx7="http://schemas.microsoft.com/office/drawing/2016/5/13/chartex" xmlns:cx8="http://schemas.microsoft.com/office/drawing/2016/5/14/chartex" xmlns:mc="http://schemas.openxmlformats.org/markup-compatibility/2006" xmlns:aink="http://schemas.microsoft.com/office/drawing/2016/ink" xmlns:am3d="http://schemas.microsoft.com/office/drawing/2017/model3d" xmlns:o="urn:schemas-microsoft-com:office:office" xmlns:oel="http://schemas.microsoft.com/office/2019/extlst" xmlns:r="http://schemas.openxmlformats.org/officeDocument/2006/relationships" xmlns:m="http://schemas.openxmlformats.org/officeDocument/2006/math" xmlns:v="urn:schemas-microsoft-com:vml" xmlns:wp14="http://schemas.microsoft.com/office/word/2010/wordprocessingDrawing" xmlns:wp="http://schemas.openxmlformats.org/drawingml/2006/wordprocessingDrawing" xmlns:w10="urn:schemas-microsoft-com:office:word" xmlns:w="http://schemas.openxmlformats.org/wordprocessingml/2006/main" xmlns:w14="http://schemas.microsoft.com/office/word/2010/wordml" xmlns:w15="http://schemas.microsoft.com/office/word/2012/wordml" xmlns:w16cex="http://schemas.microsoft.com/office/word/2018/wordml/cex" xmlns:w16cid="http://schemas.microsoft.com/office/word/2016/wordml/cid" xmlns:w16="http://schemas.microsoft.com/office/word/2018/wordml" xmlns:w16du="http://schemas.microsoft.com/office/word/2023/wordml/word16du" xmlns:w16sdtdh="http://schemas.microsoft.com/office/word/2020/wordml/sdtdatahash" xmlns:w16sdtfl="http://schemas.microsoft.com/office/word/2024/wordml/sdtformatlock" xmlns:w16se="http://schemas.microsoft.com/office/word/2015/wordml/symex" xmlns:wpg="http://schemas.microsoft.com/office/word/2010/wordprocessingGroup" xmlns:wpi="http://schemas.microsoft.com/office/word/2010/wordprocessingInk" xmlns:wne="http://schemas.microsoft.com/office/word/2006/wordml" xmlns:wps="http://schemas.microsoft.com/office/word/2010/wordprocessingShape" mc:Ignorable="w14 w15 w16se w16cid w16 w16cex w16sdtdh w16sdtfl w16du wp14">
   <w:footnote w:type="separator" w:id="-1">
     <w:p>
       <w:r>
@@ -2761,7 +2689,7 @@
 </file>
 
 <file path=word/numbering.xml><?xml version="1.0" encoding="utf-8"?>
-<w:numbering xmlns:wpc="http://schemas.microsoft.com/office/word/2010/wordprocessingCanvas" xmlns:cx="http://schemas.microsoft.com/office/drawing/2014/chartex" xmlns:cx1="http://schemas.microsoft.com/office/drawing/2015/9/8/chartex" xmlns:cx2="http://schemas.microsoft.com/office/drawing/2015/10/21/chartex" xmlns:cx3="http://schemas.microsoft.com/office/drawing/2016/5/9/chartex" xmlns:cx4="http://schemas.microsoft.com/office/drawing/2016/5/10/chartex" xmlns:cx5="http://schemas.microsoft.com/office/drawing/2016/5/11/chartex" xmlns:cx6="http://schemas.microsoft.com/office/drawing/2016/5/12/chartex" xmlns:cx7="http://schemas.microsoft.com/office/drawing/2016/5/13/chartex" xmlns:cx8="http://schemas.microsoft.com/office/drawing/2016/5/14/chartex" xmlns:mc="http://schemas.openxmlformats.org/markup-compatibility/2006" xmlns:aink="http://schemas.microsoft.com/office/drawing/2016/ink" xmlns:am3d="http://schemas.microsoft.com/office/drawing/2017/model3d" xmlns:o="urn:schemas-microsoft-com:office:office" xmlns:oel="http://schemas.microsoft.com/office/2019/extlst" xmlns:r="http://schemas.openxmlformats.org/officeDocument/2006/relationships" xmlns:m="http://schemas.openxmlformats.org/officeDocument/2006/math" xmlns:v="urn:schemas-microsoft-com:vml" xmlns:wp14="http://schemas.microsoft.com/office/word/2010/wordprocessingDrawing" xmlns:wp="http://schemas.openxmlformats.org/drawingml/2006/wordprocessingDrawing" xmlns:w10="urn:schemas-microsoft-com:office:word" xmlns:w="http://schemas.openxmlformats.org/wordprocessingml/2006/main" xmlns:w14="http://schemas.microsoft.com/office/word/2010/wordml" xmlns:w15="http://schemas.microsoft.com/office/word/2012/wordml" xmlns:w16cei="http://schemas.microsoft.com/office/word/2026/wordml/cei" xmlns:w16cex="http://schemas.microsoft.com/office/word/2018/wordml/cex" xmlns:w16cid="http://schemas.microsoft.com/office/word/2016/wordml/cid" xmlns:w16="http://schemas.microsoft.com/office/word/2018/wordml" xmlns:w16du="http://schemas.microsoft.com/office/word/2023/wordml/word16du" xmlns:w16sdtdh="http://schemas.microsoft.com/office/word/2020/wordml/sdtdatahash" xmlns:w16sdtfl="http://schemas.microsoft.com/office/word/2024/wordml/sdtformatlock" xmlns:w16se="http://schemas.microsoft.com/office/word/2015/wordml/symex" xmlns:wpg="http://schemas.microsoft.com/office/word/2010/wordprocessingGroup" xmlns:wpi="http://schemas.microsoft.com/office/word/2010/wordprocessingInk" xmlns:wne="http://schemas.microsoft.com/office/word/2006/wordml" xmlns:wps="http://schemas.microsoft.com/office/word/2010/wordprocessingShape" mc:Ignorable="w14 w15 w16se w16cid w16 w16cex w16sdtdh w16sdtfl w16du wp14">
+<w:numbering xmlns:wpc="http://schemas.microsoft.com/office/word/2010/wordprocessingCanvas" xmlns:cx="http://schemas.microsoft.com/office/drawing/2014/chartex" xmlns:cx1="http://schemas.microsoft.com/office/drawing/2015/9/8/chartex" xmlns:cx2="http://schemas.microsoft.com/office/drawing/2015/10/21/chartex" xmlns:cx3="http://schemas.microsoft.com/office/drawing/2016/5/9/chartex" xmlns:cx4="http://schemas.microsoft.com/office/drawing/2016/5/10/chartex" xmlns:cx5="http://schemas.microsoft.com/office/drawing/2016/5/11/chartex" xmlns:cx6="http://schemas.microsoft.com/office/drawing/2016/5/12/chartex" xmlns:cx7="http://schemas.microsoft.com/office/drawing/2016/5/13/chartex" xmlns:cx8="http://schemas.microsoft.com/office/drawing/2016/5/14/chartex" xmlns:mc="http://schemas.openxmlformats.org/markup-compatibility/2006" xmlns:aink="http://schemas.microsoft.com/office/drawing/2016/ink" xmlns:am3d="http://schemas.microsoft.com/office/drawing/2017/model3d" xmlns:o="urn:schemas-microsoft-com:office:office" xmlns:oel="http://schemas.microsoft.com/office/2019/extlst" xmlns:r="http://schemas.openxmlformats.org/officeDocument/2006/relationships" xmlns:m="http://schemas.openxmlformats.org/officeDocument/2006/math" xmlns:v="urn:schemas-microsoft-com:vml" xmlns:wp14="http://schemas.microsoft.com/office/word/2010/wordprocessingDrawing" xmlns:wp="http://schemas.openxmlformats.org/drawingml/2006/wordprocessingDrawing" xmlns:w10="urn:schemas-microsoft-com:office:word" xmlns:w="http://schemas.openxmlformats.org/wordprocessingml/2006/main" xmlns:w14="http://schemas.microsoft.com/office/word/2010/wordml" xmlns:w15="http://schemas.microsoft.com/office/word/2012/wordml" xmlns:w16cex="http://schemas.microsoft.com/office/word/2018/wordml/cex" xmlns:w16cid="http://schemas.microsoft.com/office/word/2016/wordml/cid" xmlns:w16="http://schemas.microsoft.com/office/word/2018/wordml" xmlns:w16du="http://schemas.microsoft.com/office/word/2023/wordml/word16du" xmlns:w16sdtdh="http://schemas.microsoft.com/office/word/2020/wordml/sdtdatahash" xmlns:w16sdtfl="http://schemas.microsoft.com/office/word/2024/wordml/sdtformatlock" xmlns:w16se="http://schemas.microsoft.com/office/word/2015/wordml/symex" xmlns:wpg="http://schemas.microsoft.com/office/word/2010/wordprocessingGroup" xmlns:wpi="http://schemas.microsoft.com/office/word/2010/wordprocessingInk" xmlns:wne="http://schemas.microsoft.com/office/word/2006/wordml" xmlns:wps="http://schemas.microsoft.com/office/word/2010/wordprocessingShape" mc:Ignorable="w14 w15 w16se w16cid w16 w16cex w16sdtdh w16sdtfl w16du wp14">
   <w:abstractNum w:abstractNumId="0" w15:restartNumberingAfterBreak="0">
     <w:nsid w:val="03630F36"/>
     <w:multiLevelType w:val="multilevel"/>

</xml_diff>

<commit_message>
Sync Chang Chun role and resume
</commit_message>
<xml_diff>
--- a/files/Resume.docx
+++ b/files/Resume.docx
@@ -1701,6 +1701,26 @@
       </w:pPr>
       <w:r>
         <w:rPr>
+          <w:rFonts w:ascii="Calibri" w:hAnsi="Calibri" w:cs="Calibri" w:hint="eastAsia"/>
+          <w:b/>
+          <w:bCs/>
+          <w:iCs/>
+          <w:sz w:val="21"/>
+          <w:szCs w:val="21"/>
+        </w:rPr>
+        <w:t xml:space="preserve">Robotics Software </w:t>
+      </w:r>
+      <w:r>
+        <w:rPr>
+          <w:rFonts w:ascii="Calibri" w:hAnsi="Calibri" w:cs="Calibri" w:hint="eastAsia"/>
+          <w:b/>
+          <w:sz w:val="21"/>
+          <w:szCs w:val="21"/>
+        </w:rPr>
+        <w:t xml:space="preserve">Engineer </w:t>
+      </w:r>
+      <w:r>
+        <w:rPr>
           <w:rFonts w:ascii="Calibri" w:hAnsi="Calibri" w:cs="Calibri"/>
           <w:b/>
           <w:bCs/>
@@ -1804,15 +1824,15 @@
           <w:sz w:val="21"/>
           <w:szCs w:val="21"/>
         </w:rPr>
-        <w:t xml:space="preserve">     </w:t>
-      </w:r>
-      <w:r>
-        <w:rPr>
-          <w:rFonts w:ascii="Calibri" w:hAnsi="Calibri" w:cs="Calibri"/>
-          <w:sz w:val="21"/>
-          <w:szCs w:val="21"/>
-        </w:rPr>
-        <w:t xml:space="preserve">                                                 </w:t>
+        <w:t xml:space="preserve">  </w:t>
+      </w:r>
+      <w:r>
+        <w:rPr>
+          <w:rFonts w:ascii="Calibri" w:hAnsi="Calibri" w:cs="Calibri" w:hint="eastAsia"/>
+          <w:sz w:val="21"/>
+          <w:szCs w:val="21"/>
+        </w:rPr>
+        <w:t xml:space="preserve"> </w:t>
       </w:r>
       <w:r>
         <w:rPr>
@@ -1960,7 +1980,25 @@
           <w:sz w:val="21"/>
           <w:szCs w:val="21"/>
         </w:rPr>
-        <w:t xml:space="preserve"> robotic arm, achieving 100% grasp success in simulation across a 35–65 cm workspace by integrating a ROS 2/NVIDIA Isaac Sim digital twin with a transformer-based ACT++ control pipeline</w:t>
+        <w:t xml:space="preserve"> robotic arm, </w:t>
+      </w:r>
+      <w:r>
+        <w:rPr>
+          <w:rFonts w:ascii="Calibri" w:eastAsia="Times New Roman" w:hAnsi="Calibri" w:cs="Calibri"/>
+          <w:color w:val="000000"/>
+          <w:sz w:val="21"/>
+          <w:szCs w:val="21"/>
+        </w:rPr>
+        <w:t>achieving 100% grasp success across 30 simulation trials within a 35–65 cm workspace</w:t>
+      </w:r>
+      <w:r>
+        <w:rPr>
+          <w:rFonts w:ascii="Calibri" w:eastAsia="Times New Roman" w:hAnsi="Calibri" w:cs="Calibri"/>
+          <w:color w:val="000000"/>
+          <w:sz w:val="21"/>
+          <w:szCs w:val="21"/>
+        </w:rPr>
+        <w:t xml:space="preserve"> by integrating a ROS 2/NVIDIA Isaac Sim digital twin with a transformer-based ACT++ control pipeline</w:t>
       </w:r>
     </w:p>
     <w:p>
@@ -2085,25 +2123,7 @@
           <w:sz w:val="21"/>
           <w:szCs w:val="21"/>
         </w:rPr>
-        <w:t>Yejin Kim, Wilbert Pumacay, Omar Rayyan, et al.</w:t>
-      </w:r>
-      <w:r>
-        <w:rPr>
-          <w:rFonts w:ascii="Calibri" w:hAnsi="Calibri" w:cs="Calibri" w:hint="eastAsia"/>
-          <w:color w:val="000000"/>
-          <w:sz w:val="21"/>
-          <w:szCs w:val="21"/>
-        </w:rPr>
-        <w:t>,</w:t>
-      </w:r>
-      <w:r>
-        <w:rPr>
-          <w:rFonts w:ascii="Calibri" w:eastAsia="Times New Roman" w:hAnsi="Calibri" w:cs="Calibri"/>
-          <w:color w:val="000000"/>
-          <w:sz w:val="21"/>
-          <w:szCs w:val="21"/>
-        </w:rPr>
-        <w:t xml:space="preserve"> (</w:t>
+        <w:t xml:space="preserve">Shirui Chen, Cole Harrison, </w:t>
       </w:r>
       <w:r>
         <w:rPr>
@@ -2123,7 +2143,7 @@
           <w:sz w:val="21"/>
           <w:szCs w:val="21"/>
         </w:rPr>
-        <w:t>), “MolmoSpaces: Large-Scale Open Ecosystem for Robot Manipulation and Navigation,” Robotics: Science and Systems (RSS), 2026</w:t>
+        <w:t>, et al., “TOPReward: Token Probabilities as Hidden Zero-Shot Rewards for Robotics,”</w:t>
       </w:r>
       <w:r>
         <w:rPr>
@@ -2132,17 +2152,35 @@
           <w:sz w:val="21"/>
           <w:szCs w:val="21"/>
         </w:rPr>
-        <w:t xml:space="preserve">. </w:t>
+        <w:t xml:space="preserve"> </w:t>
+      </w:r>
+      <w:r>
+        <w:rPr>
+          <w:rFonts w:ascii="Calibri" w:hAnsi="Calibri" w:cs="Calibri"/>
+          <w:color w:val="000000"/>
+          <w:sz w:val="21"/>
+          <w:szCs w:val="21"/>
+        </w:rPr>
+        <w:t>Conference on Robot Learning (CoRL), 2026.</w:t>
+      </w:r>
+      <w:r>
+        <w:rPr>
+          <w:rFonts w:ascii="Calibri" w:hAnsi="Calibri" w:cs="Calibri" w:hint="eastAsia"/>
+          <w:color w:val="000000"/>
+          <w:sz w:val="21"/>
+          <w:szCs w:val="21"/>
+        </w:rPr>
+        <w:t xml:space="preserve"> </w:t>
       </w:r>
       <w:hyperlink r:id="rId11" w:history="1">
         <w:r>
           <w:rPr>
             <w:rStyle w:val="aa"/>
-            <w:rFonts w:ascii="Calibri" w:eastAsia="Times New Roman" w:hAnsi="Calibri" w:cs="Calibri"/>
+            <w:rFonts w:ascii="Calibri" w:hAnsi="Calibri" w:cs="Calibri"/>
             <w:sz w:val="21"/>
             <w:szCs w:val="21"/>
           </w:rPr>
-          <w:t>arXiv:2602.11337</w:t>
+          <w:t>arXiv:2602.19313</w:t>
         </w:r>
       </w:hyperlink>
     </w:p>
@@ -2171,6 +2209,15 @@
       <w:r>
         <w:rPr>
           <w:rFonts w:ascii="Calibri" w:eastAsia="Times New Roman" w:hAnsi="Calibri" w:cs="Calibri"/>
+          <w:color w:val="000000"/>
+          <w:sz w:val="21"/>
+          <w:szCs w:val="21"/>
+        </w:rPr>
+        <w:t xml:space="preserve">Abhay Deshpande, Maya Guru, Rose Hendrix, ..., </w:t>
+      </w:r>
+      <w:r>
+        <w:rPr>
+          <w:rFonts w:ascii="Calibri" w:eastAsia="Times New Roman" w:hAnsi="Calibri" w:cs="Calibri"/>
           <w:b/>
           <w:bCs/>
           <w:color w:val="000000"/>
@@ -2186,34 +2233,16 @@
           <w:sz w:val="21"/>
           <w:szCs w:val="21"/>
         </w:rPr>
-        <w:t xml:space="preserve">, </w:t>
-      </w:r>
-      <w:r>
-        <w:rPr>
-          <w:rFonts w:ascii="Calibri" w:eastAsia="Times New Roman" w:hAnsi="Calibri" w:cs="Calibri"/>
-          <w:color w:val="000000"/>
-          <w:sz w:val="21"/>
-          <w:szCs w:val="21"/>
-        </w:rPr>
-        <w:t>Chih-Yang Lin</w:t>
-      </w:r>
-      <w:r>
-        <w:rPr>
-          <w:rFonts w:ascii="Calibri" w:eastAsia="Times New Roman" w:hAnsi="Calibri" w:cs="Calibri"/>
-          <w:color w:val="000000"/>
-          <w:sz w:val="21"/>
-          <w:szCs w:val="21"/>
-        </w:rPr>
-        <w:t xml:space="preserve">, </w:t>
-      </w:r>
-      <w:r>
-        <w:rPr>
-          <w:rFonts w:ascii="Calibri" w:eastAsia="Times New Roman" w:hAnsi="Calibri" w:cs="Calibri"/>
-          <w:color w:val="000000"/>
-          <w:sz w:val="21"/>
-          <w:szCs w:val="21"/>
-        </w:rPr>
-        <w:t>Chia-Chun Hsiao</w:t>
+        <w:t>, ..., Ranjay Krishna</w:t>
+      </w:r>
+      <w:r>
+        <w:rPr>
+          <w:rFonts w:ascii="Calibri" w:eastAsia="Times New Roman" w:hAnsi="Calibri" w:cs="Calibri"/>
+          <w:color w:val="000000"/>
+          <w:sz w:val="21"/>
+          <w:szCs w:val="21"/>
+        </w:rPr>
+        <w:t xml:space="preserve">, “MolmoB0T: Large-Scale Simulation Enables Zero-Shot Manipulation,” Conference on Robot Learning (CoRL), 2026. Best </w:t>
       </w:r>
       <w:r>
         <w:rPr>
@@ -2222,16 +2251,25 @@
           <w:sz w:val="21"/>
           <w:szCs w:val="21"/>
         </w:rPr>
-        <w:t xml:space="preserve">, </w:t>
-      </w:r>
-      <w:r>
-        <w:rPr>
-          <w:rFonts w:ascii="Calibri" w:eastAsia="Times New Roman" w:hAnsi="Calibri" w:cs="Calibri"/>
-          <w:color w:val="000000"/>
-          <w:sz w:val="21"/>
-          <w:szCs w:val="21"/>
-        </w:rPr>
-        <w:t xml:space="preserve">et al., “Using Deep Learning-Based Methods for Automated Segmentation of Soft Tissues from Shoulder Ultrasound Images,” IEEE Access, Vol. 12, pp. 111,481-111,492, July 2024. </w:t>
+        <w:t>Paper</w:t>
+      </w:r>
+      <w:r>
+        <w:rPr>
+          <w:rFonts w:ascii="Calibri" w:eastAsia="Times New Roman" w:hAnsi="Calibri" w:cs="Calibri"/>
+          <w:color w:val="000000"/>
+          <w:sz w:val="21"/>
+          <w:szCs w:val="21"/>
+        </w:rPr>
+        <w:t xml:space="preserve"> Award, IEEE ICRA 2026 Workshop on Synthetic Data for Robot Learning.</w:t>
+      </w:r>
+      <w:r>
+        <w:rPr>
+          <w:rFonts w:ascii="Calibri" w:hAnsi="Calibri" w:cs="Calibri" w:hint="eastAsia"/>
+          <w:color w:val="000000"/>
+          <w:sz w:val="21"/>
+          <w:szCs w:val="21"/>
+        </w:rPr>
+        <w:t xml:space="preserve"> </w:t>
       </w:r>
       <w:hyperlink r:id="rId12" w:history="1">
         <w:r>
@@ -2241,7 +2279,7 @@
             <w:sz w:val="21"/>
             <w:szCs w:val="21"/>
           </w:rPr>
-          <w:t>DOI: 10.1109/ACCESS.2024.3432691</w:t>
+          <w:t>arXiv:2603.16861</w:t>
         </w:r>
       </w:hyperlink>
     </w:p>
@@ -2274,7 +2312,7 @@
           <w:sz w:val="21"/>
           <w:szCs w:val="21"/>
         </w:rPr>
-        <w:t>Abhay Deshpande, Maya Guru, Rose Hendrix, et al., (</w:t>
+        <w:t xml:space="preserve">Haoquan Fang, Jiafei Duan, Donovan Clay, ..., </w:t>
       </w:r>
       <w:r>
         <w:rPr>
@@ -2294,7 +2332,61 @@
           <w:sz w:val="21"/>
           <w:szCs w:val="21"/>
         </w:rPr>
-        <w:t xml:space="preserve">), “MolmoB0T: Large-Scale Simulation Enables Zero-Shot Manipulation,” under review at the Conference on Robot Learning (CoRL), 2026. Best </w:t>
+        <w:t>, ..., Ranjay Krishna,</w:t>
+      </w:r>
+      <w:r>
+        <w:rPr>
+          <w:rFonts w:ascii="Calibri" w:eastAsia="Times New Roman" w:hAnsi="Calibri" w:cs="Calibri"/>
+          <w:color w:val="000000"/>
+          <w:sz w:val="21"/>
+          <w:szCs w:val="21"/>
+        </w:rPr>
+        <w:t xml:space="preserve"> </w:t>
+      </w:r>
+      <w:r>
+        <w:rPr>
+          <w:rFonts w:ascii="Calibri" w:eastAsia="Times New Roman" w:hAnsi="Calibri" w:cs="Calibri"/>
+          <w:color w:val="000000"/>
+          <w:sz w:val="21"/>
+          <w:szCs w:val="21"/>
+        </w:rPr>
+        <w:t>“</w:t>
+      </w:r>
+      <w:r>
+        <w:rPr>
+          <w:rFonts w:ascii="Calibri" w:eastAsia="Times New Roman" w:hAnsi="Calibri" w:cs="Calibri"/>
+          <w:color w:val="000000"/>
+          <w:sz w:val="21"/>
+          <w:szCs w:val="21"/>
+        </w:rPr>
+        <w:t xml:space="preserve">MolmoAct2: Action Reasoning Models for </w:t>
+      </w:r>
+      <w:r>
+        <w:rPr>
+          <w:rFonts w:ascii="Calibri" w:eastAsia="Times New Roman" w:hAnsi="Calibri" w:cs="Calibri"/>
+          <w:color w:val="000000"/>
+          <w:sz w:val="21"/>
+          <w:szCs w:val="21"/>
+        </w:rPr>
+        <w:t>Real-world</w:t>
+      </w:r>
+      <w:r>
+        <w:rPr>
+          <w:rFonts w:ascii="Calibri" w:eastAsia="Times New Roman" w:hAnsi="Calibri" w:cs="Calibri"/>
+          <w:color w:val="000000"/>
+          <w:sz w:val="21"/>
+          <w:szCs w:val="21"/>
+        </w:rPr>
+        <w:t xml:space="preserve"> Deployment,</w:t>
+      </w:r>
+      <w:r>
+        <w:rPr>
+          <w:rFonts w:ascii="Calibri" w:eastAsia="Times New Roman" w:hAnsi="Calibri" w:cs="Calibri"/>
+          <w:color w:val="000000"/>
+          <w:sz w:val="21"/>
+          <w:szCs w:val="21"/>
+        </w:rPr>
+        <w:t>”</w:t>
       </w:r>
       <w:r>
         <w:rPr>
@@ -2303,20 +2395,20 @@
           <w:sz w:val="21"/>
           <w:szCs w:val="21"/>
         </w:rPr>
-        <w:t>Paper</w:t>
-      </w:r>
-      <w:r>
-        <w:rPr>
-          <w:rFonts w:ascii="Calibri" w:eastAsia="Times New Roman" w:hAnsi="Calibri" w:cs="Calibri"/>
-          <w:color w:val="000000"/>
-          <w:sz w:val="21"/>
-          <w:szCs w:val="21"/>
-        </w:rPr>
-        <w:t xml:space="preserve"> Award, IEEE ICRA 2026 Workshop on Synthetic Data for Robot Learning.</w:t>
-      </w:r>
-      <w:r>
-        <w:rPr>
-          <w:rFonts w:ascii="Calibri" w:hAnsi="Calibri" w:cs="Calibri" w:hint="eastAsia"/>
+        <w:t xml:space="preserve"> </w:t>
+      </w:r>
+      <w:r>
+        <w:rPr>
+          <w:rFonts w:ascii="Calibri" w:hAnsi="Calibri" w:cs="Calibri"/>
+          <w:color w:val="000000"/>
+          <w:sz w:val="21"/>
+          <w:szCs w:val="21"/>
+        </w:rPr>
+        <w:t>Conference on Robot Learning (CoRL), 2026.</w:t>
+      </w:r>
+      <w:r>
+        <w:rPr>
+          <w:rFonts w:ascii="Calibri" w:eastAsia="Times New Roman" w:hAnsi="Calibri" w:cs="Calibri"/>
           <w:color w:val="000000"/>
           <w:sz w:val="21"/>
           <w:szCs w:val="21"/>
@@ -2331,7 +2423,7 @@
             <w:sz w:val="21"/>
             <w:szCs w:val="21"/>
           </w:rPr>
-          <w:t>arXiv:2603.16861</w:t>
+          <w:t>arXiv:2605.02881</w:t>
         </w:r>
       </w:hyperlink>
     </w:p>
@@ -2364,43 +2456,7 @@
           <w:sz w:val="21"/>
           <w:szCs w:val="21"/>
         </w:rPr>
-        <w:t xml:space="preserve">Haoquan Fang, Jiafei Duan, Donovan Clay, </w:t>
-      </w:r>
-      <w:r>
-        <w:rPr>
-          <w:rFonts w:ascii="Calibri" w:eastAsia="Times New Roman" w:hAnsi="Calibri" w:cs="Calibri"/>
-          <w:color w:val="000000"/>
-          <w:sz w:val="21"/>
-          <w:szCs w:val="21"/>
-        </w:rPr>
-        <w:t>et al.</w:t>
-      </w:r>
-      <w:r>
-        <w:rPr>
-          <w:rFonts w:ascii="Calibri" w:hAnsi="Calibri" w:cs="Calibri" w:hint="eastAsia"/>
-          <w:color w:val="000000"/>
-          <w:sz w:val="21"/>
-          <w:szCs w:val="21"/>
-        </w:rPr>
-        <w:t>,</w:t>
-      </w:r>
-      <w:r>
-        <w:rPr>
-          <w:rFonts w:ascii="Calibri" w:eastAsia="Times New Roman" w:hAnsi="Calibri" w:cs="Calibri"/>
-          <w:color w:val="000000"/>
-          <w:sz w:val="21"/>
-          <w:szCs w:val="21"/>
-        </w:rPr>
-        <w:t xml:space="preserve"> </w:t>
-      </w:r>
-      <w:r>
-        <w:rPr>
-          <w:rFonts w:ascii="Calibri" w:hAnsi="Calibri" w:cs="Calibri" w:hint="eastAsia"/>
-          <w:color w:val="000000"/>
-          <w:sz w:val="21"/>
-          <w:szCs w:val="21"/>
-        </w:rPr>
-        <w:t>(</w:t>
+        <w:t xml:space="preserve">Yejin Kim, Wilbert Pumacay, ..., </w:t>
       </w:r>
       <w:r>
         <w:rPr>
@@ -2415,75 +2471,30 @@
       </w:r>
       <w:r>
         <w:rPr>
+          <w:rFonts w:ascii="Calibri" w:eastAsia="Times New Roman" w:hAnsi="Calibri" w:cs="Calibri"/>
+          <w:color w:val="000000"/>
+          <w:sz w:val="21"/>
+          <w:szCs w:val="21"/>
+        </w:rPr>
+        <w:t>, ..., Ranjay Krishna,</w:t>
+      </w:r>
+      <w:r>
+        <w:rPr>
           <w:rFonts w:ascii="Calibri" w:hAnsi="Calibri" w:cs="Calibri" w:hint="eastAsia"/>
           <w:color w:val="000000"/>
           <w:sz w:val="21"/>
           <w:szCs w:val="21"/>
         </w:rPr>
-        <w:t>)</w:t>
-      </w:r>
-      <w:r>
-        <w:rPr>
-          <w:rFonts w:ascii="Calibri" w:eastAsia="Times New Roman" w:hAnsi="Calibri" w:cs="Calibri"/>
-          <w:color w:val="000000"/>
-          <w:sz w:val="21"/>
-          <w:szCs w:val="21"/>
-        </w:rPr>
-        <w:t xml:space="preserve">, </w:t>
-      </w:r>
-      <w:r>
-        <w:rPr>
-          <w:rFonts w:ascii="Calibri" w:eastAsia="Times New Roman" w:hAnsi="Calibri" w:cs="Calibri"/>
-          <w:color w:val="000000"/>
-          <w:sz w:val="21"/>
-          <w:szCs w:val="21"/>
-        </w:rPr>
-        <w:t>“</w:t>
-      </w:r>
-      <w:r>
-        <w:rPr>
-          <w:rFonts w:ascii="Calibri" w:eastAsia="Times New Roman" w:hAnsi="Calibri" w:cs="Calibri"/>
-          <w:color w:val="000000"/>
-          <w:sz w:val="21"/>
-          <w:szCs w:val="21"/>
-        </w:rPr>
-        <w:t xml:space="preserve">MolmoAct2: Action Reasoning Models for </w:t>
-      </w:r>
-      <w:r>
-        <w:rPr>
-          <w:rFonts w:ascii="Calibri" w:eastAsia="Times New Roman" w:hAnsi="Calibri" w:cs="Calibri"/>
-          <w:color w:val="000000"/>
-          <w:sz w:val="21"/>
-          <w:szCs w:val="21"/>
-        </w:rPr>
-        <w:t>Real-world</w:t>
-      </w:r>
-      <w:r>
-        <w:rPr>
-          <w:rFonts w:ascii="Calibri" w:eastAsia="Times New Roman" w:hAnsi="Calibri" w:cs="Calibri"/>
-          <w:color w:val="000000"/>
-          <w:sz w:val="21"/>
-          <w:szCs w:val="21"/>
-        </w:rPr>
-        <w:t xml:space="preserve"> Deployment</w:t>
-      </w:r>
-      <w:r>
-        <w:rPr>
-          <w:rFonts w:ascii="Calibri" w:eastAsia="Times New Roman" w:hAnsi="Calibri" w:cs="Calibri"/>
-          <w:color w:val="000000"/>
-          <w:sz w:val="21"/>
-          <w:szCs w:val="21"/>
-        </w:rPr>
-        <w:t>,</w:t>
-      </w:r>
-      <w:r>
-        <w:rPr>
-          <w:rFonts w:ascii="Calibri" w:eastAsia="Times New Roman" w:hAnsi="Calibri" w:cs="Calibri"/>
-          <w:color w:val="000000"/>
-          <w:sz w:val="21"/>
-          <w:szCs w:val="21"/>
-        </w:rPr>
-        <w:t>”</w:t>
+        <w:t xml:space="preserve"> </w:t>
+      </w:r>
+      <w:r>
+        <w:rPr>
+          <w:rFonts w:ascii="Calibri" w:eastAsia="Times New Roman" w:hAnsi="Calibri" w:cs="Calibri"/>
+          <w:color w:val="000000"/>
+          <w:sz w:val="21"/>
+          <w:szCs w:val="21"/>
+        </w:rPr>
+        <w:t>“MolmoSpaces: Large-Scale Open Ecosystem for Robot Manipulation and Navigation,” Robotics: Science and Systems (RSS), 2026</w:t>
       </w:r>
       <w:r>
         <w:rPr>
@@ -2492,35 +2503,17 @@
           <w:sz w:val="21"/>
           <w:szCs w:val="21"/>
         </w:rPr>
-        <w:t xml:space="preserve"> </w:t>
-      </w:r>
-      <w:r>
-        <w:rPr>
-          <w:rFonts w:ascii="Calibri" w:hAnsi="Calibri" w:cs="Calibri"/>
-          <w:color w:val="000000"/>
-          <w:sz w:val="21"/>
-          <w:szCs w:val="21"/>
-        </w:rPr>
-        <w:t>under review at the Conference on Robot Learning (CoRL), 2026.</w:t>
-      </w:r>
-      <w:r>
-        <w:rPr>
-          <w:rFonts w:ascii="Calibri" w:eastAsia="Times New Roman" w:hAnsi="Calibri" w:cs="Calibri"/>
-          <w:color w:val="000000"/>
-          <w:sz w:val="21"/>
-          <w:szCs w:val="21"/>
-        </w:rPr>
-        <w:t xml:space="preserve"> </w:t>
+        <w:t xml:space="preserve">. </w:t>
       </w:r>
       <w:hyperlink r:id="rId14" w:history="1">
         <w:r>
           <w:rPr>
             <w:rStyle w:val="aa"/>
-            <w:rFonts w:ascii="Calibri" w:eastAsia="Times New Roman" w:hAnsi="Calibri" w:cs="Calibri"/>
+            <w:rFonts w:ascii="Calibri" w:hAnsi="Calibri" w:cs="Calibri"/>
             <w:sz w:val="21"/>
             <w:szCs w:val="21"/>
           </w:rPr>
-          <w:t>arXiv:2605.02881</w:t>
+          <w:t>DOI: 10.15607/RSS.2026.XXII.091</w:t>
         </w:r>
       </w:hyperlink>
     </w:p>
@@ -2549,15 +2542,6 @@
       <w:r>
         <w:rPr>
           <w:rFonts w:ascii="Calibri" w:eastAsia="Times New Roman" w:hAnsi="Calibri" w:cs="Calibri"/>
-          <w:color w:val="000000"/>
-          <w:sz w:val="21"/>
-          <w:szCs w:val="21"/>
-        </w:rPr>
-        <w:t xml:space="preserve">Shirui Chen, Cole Harrison, </w:t>
-      </w:r>
-      <w:r>
-        <w:rPr>
-          <w:rFonts w:ascii="Calibri" w:eastAsia="Times New Roman" w:hAnsi="Calibri" w:cs="Calibri"/>
           <w:b/>
           <w:bCs/>
           <w:color w:val="000000"/>
@@ -2573,7 +2557,34 @@
           <w:sz w:val="21"/>
           <w:szCs w:val="21"/>
         </w:rPr>
-        <w:t>, et al., “TOPReward: Token Probabilities as Hidden Zero-Shot Rewards for Robotics,”</w:t>
+        <w:t xml:space="preserve">, </w:t>
+      </w:r>
+      <w:r>
+        <w:rPr>
+          <w:rFonts w:ascii="Calibri" w:eastAsia="Times New Roman" w:hAnsi="Calibri" w:cs="Calibri"/>
+          <w:color w:val="000000"/>
+          <w:sz w:val="21"/>
+          <w:szCs w:val="21"/>
+        </w:rPr>
+        <w:t>Chih-Yang Lin</w:t>
+      </w:r>
+      <w:r>
+        <w:rPr>
+          <w:rFonts w:ascii="Calibri" w:eastAsia="Times New Roman" w:hAnsi="Calibri" w:cs="Calibri"/>
+          <w:color w:val="000000"/>
+          <w:sz w:val="21"/>
+          <w:szCs w:val="21"/>
+        </w:rPr>
+        <w:t xml:space="preserve">, </w:t>
+      </w:r>
+      <w:r>
+        <w:rPr>
+          <w:rFonts w:ascii="Calibri" w:eastAsia="Times New Roman" w:hAnsi="Calibri" w:cs="Calibri"/>
+          <w:color w:val="000000"/>
+          <w:sz w:val="21"/>
+          <w:szCs w:val="21"/>
+        </w:rPr>
+        <w:t>Chia-Chun Hsiao</w:t>
       </w:r>
       <w:r>
         <w:rPr>
@@ -2582,35 +2593,26 @@
           <w:sz w:val="21"/>
           <w:szCs w:val="21"/>
         </w:rPr>
-        <w:t xml:space="preserve"> </w:t>
-      </w:r>
-      <w:r>
-        <w:rPr>
-          <w:rFonts w:ascii="Calibri" w:hAnsi="Calibri" w:cs="Calibri"/>
-          <w:color w:val="000000"/>
-          <w:sz w:val="21"/>
-          <w:szCs w:val="21"/>
-        </w:rPr>
-        <w:t>under review at the Conference on Robot Learning (CoRL), 2026.</w:t>
-      </w:r>
-      <w:r>
-        <w:rPr>
-          <w:rFonts w:ascii="Calibri" w:hAnsi="Calibri" w:cs="Calibri" w:hint="eastAsia"/>
-          <w:color w:val="000000"/>
-          <w:sz w:val="21"/>
-          <w:szCs w:val="21"/>
-        </w:rPr>
-        <w:t xml:space="preserve"> </w:t>
+        <w:t xml:space="preserve">, </w:t>
+      </w:r>
+      <w:r>
+        <w:rPr>
+          <w:rFonts w:ascii="Calibri" w:eastAsia="Times New Roman" w:hAnsi="Calibri" w:cs="Calibri"/>
+          <w:color w:val="000000"/>
+          <w:sz w:val="21"/>
+          <w:szCs w:val="21"/>
+        </w:rPr>
+        <w:t xml:space="preserve">et al., “Using Deep Learning-Based Methods for Automated Segmentation of Soft Tissues from Shoulder Ultrasound Images,” IEEE Access, Vol. 12, pp. 111,481-111,492, July 2024. </w:t>
       </w:r>
       <w:hyperlink r:id="rId15" w:history="1">
         <w:r>
           <w:rPr>
             <w:rStyle w:val="aa"/>
-            <w:rFonts w:ascii="Calibri" w:hAnsi="Calibri" w:cs="Calibri"/>
+            <w:rFonts w:ascii="Calibri" w:eastAsia="Times New Roman" w:hAnsi="Calibri" w:cs="Calibri"/>
             <w:sz w:val="21"/>
             <w:szCs w:val="21"/>
           </w:rPr>
-          <w:t>arXiv:2602.19313</w:t>
+          <w:t>DOI: 10.1109/ACCESS.2024.3432691</w:t>
         </w:r>
       </w:hyperlink>
     </w:p>
@@ -8799,7 +8801,7 @@
   <w:style w:type="paragraph" w:default="1" w:styleId="a">
     <w:name w:val="Normal"/>
     <w:qFormat/>
-    <w:rsid w:val="007437B9"/>
+    <w:rsid w:val="00003CCF"/>
   </w:style>
   <w:style w:type="paragraph" w:styleId="1">
     <w:name w:val="heading 1"/>
@@ -8920,6 +8922,7 @@
   <w:style w:type="character" w:default="1" w:styleId="a0">
     <w:name w:val="Default Paragraph Font"/>
     <w:uiPriority w:val="1"/>
+    <w:semiHidden/>
     <w:unhideWhenUsed/>
   </w:style>
   <w:style w:type="table" w:default="1" w:styleId="a1">

</xml_diff>